<commit_message>
docs: corrige contagem de testes e ano na parte teorica
- Atualiza ano da capa (2025 -> 2026)
- Corrige numero de testes READ na tabela 7.1 (4 -> 5)
- Atualiza total geral (17 -> 18) na tabela e no texto sobre CI
</commit_message>
<xml_diff>
--- a/docs/parte_teorica.docx
+++ b/docs/parte_teorica.docx
@@ -1,5 +1,27 @@
 
-<file path=word/document.xml><?xml version="1.0" encoding="utf-8"?>
+<file path=docProps\app.xml><?xml version="1.0" encoding="utf-8"?>
+<Properties xmlns="http://schemas.openxmlformats.org/officeDocument/2006/extended-properties" xmlns:vt="http://schemas.openxmlformats.org/officeDocument/2006/docPropsVTypes"/>
+</file>
+
+<file path=docProps\core.xml><?xml version="1.0" encoding="utf-8"?>
+<cp:coreProperties xmlns:cp="http://schemas.openxmlformats.org/package/2006/metadata/core-properties" xmlns:dc="http://purl.org/dc/elements/1.1/" xmlns:dcterms="http://purl.org/dc/terms/" xmlns:dcmitype="http://purl.org/dc/dcmitype/" xmlns:xsi="http://www.w3.org/2001/XMLSchema-instance">
+  <dc:creator>Un-named</dc:creator>
+  <cp:lastModifiedBy>Un-named</cp:lastModifiedBy>
+  <cp:revision>1</cp:revision>
+  <dcterms:created xsi:type="dcterms:W3CDTF">2026-05-28T03:27:59.190Z</dcterms:created>
+  <dcterms:modified xsi:type="dcterms:W3CDTF">2026-05-28T03:27:59.203Z</dcterms:modified>
+</cp:coreProperties>
+</file>
+
+<file path=docProps\custom.xml><?xml version="1.0" encoding="utf-8"?>
+<Properties xmlns="http://schemas.openxmlformats.org/officeDocument/2006/custom-properties" xmlns:vt="http://schemas.openxmlformats.org/officeDocument/2006/docPropsVTypes"/>
+</file>
+
+<file path=word\comments.xml><?xml version="1.0" encoding="utf-8"?>
+<w:comments xmlns:cx="http://schemas.microsoft.com/office/drawing/2014/chartex" xmlns:cx1="http://schemas.microsoft.com/office/drawing/2015/9/8/chartex" xmlns:cx2="http://schemas.microsoft.com/office/drawing/2015/10/21/chartex" xmlns:cx3="http://schemas.microsoft.com/office/drawing/2016/5/9/chartex" xmlns:cx4="http://schemas.microsoft.com/office/drawing/2016/5/10/chartex" xmlns:cx5="http://schemas.microsoft.com/office/drawing/2016/5/11/chartex" xmlns:cx6="http://schemas.microsoft.com/office/drawing/2016/5/12/chartex" xmlns:cx7="http://schemas.microsoft.com/office/drawing/2016/5/13/chartex" xmlns:cx8="http://schemas.microsoft.com/office/drawing/2016/5/14/chartex" xmlns:mc="http://schemas.openxmlformats.org/markup-compatibility/2006" xmlns:aink="http://schemas.microsoft.com/office/drawing/2016/ink" xmlns:am3d="http://schemas.microsoft.com/office/drawing/2017/model3d" xmlns:o="urn:schemas-microsoft-com:office:office" xmlns:r="http://schemas.openxmlformats.org/officeDocument/2006/relationships" xmlns:m="http://schemas.openxmlformats.org/officeDocument/2006/math" xmlns:v="urn:schemas-microsoft-com:vml" xmlns:wp14="http://schemas.microsoft.com/office/word/2010/wordprocessingDrawing" xmlns:wp="http://schemas.openxmlformats.org/drawingml/2006/wordprocessingDrawing" xmlns:w10="urn:schemas-microsoft-com:office:word" xmlns:w="http://schemas.openxmlformats.org/wordprocessingml/2006/main" xmlns:w14="http://schemas.microsoft.com/office/word/2010/wordml" xmlns:w15="http://schemas.microsoft.com/office/word/2012/wordml" xmlns:w16cex="http://schemas.microsoft.com/office/word/2018/wordml/cex" xmlns:w16cid="http://schemas.microsoft.com/office/word/2016/wordml/cid" xmlns:w16="http://schemas.microsoft.com/office/word/2018/wordml" xmlns:w16sdtdh="http://schemas.microsoft.com/office/word/2020/wordml/sdtdatahash" xmlns:w16se="http://schemas.microsoft.com/office/word/2015/wordml/symex" xmlns:wpg="http://schemas.microsoft.com/office/word/2010/wordprocessingGroup" xmlns:wpi="http://schemas.microsoft.com/office/word/2010/wordprocessingInk" xmlns:wne="http://schemas.microsoft.com/office/word/2006/wordml" xmlns:wps="http://schemas.microsoft.com/office/word/2010/wordprocessingShape"/>
+</file>
+
+<file path=word\document.xml><?xml version="1.0" encoding="utf-8"?>
 <w:document xmlns:wpc="http://schemas.microsoft.com/office/word/2010/wordprocessingCanvas" xmlns:mc="http://schemas.openxmlformats.org/markup-compatibility/2006" xmlns:o="urn:schemas-microsoft-com:office:office" xmlns:r="http://schemas.openxmlformats.org/officeDocument/2006/relationships" xmlns:m="http://schemas.openxmlformats.org/officeDocument/2006/math" xmlns:v="urn:schemas-microsoft-com:vml" xmlns:wp14="http://schemas.microsoft.com/office/word/2010/wordprocessingDrawing" xmlns:wp="http://schemas.openxmlformats.org/drawingml/2006/wordprocessingDrawing" xmlns:w10="urn:schemas-microsoft-com:office:word" xmlns:w="http://schemas.openxmlformats.org/wordprocessingml/2006/main" xmlns:w14="http://schemas.microsoft.com/office/word/2010/wordml" xmlns:w15="http://schemas.microsoft.com/office/word/2012/wordml" xmlns:wpg="http://schemas.microsoft.com/office/word/2010/wordprocessingGroup" xmlns:wpi="http://schemas.microsoft.com/office/word/2010/wordprocessingInk" xmlns:wne="http://schemas.microsoft.com/office/word/2006/wordml" xmlns:wps="http://schemas.microsoft.com/office/word/2010/wordprocessingShape" xmlns:cx="http://schemas.microsoft.com/office/drawing/2014/chartex" xmlns:cx1="http://schemas.microsoft.com/office/drawing/2015/9/8/chartex" xmlns:cx2="http://schemas.microsoft.com/office/drawing/2015/10/21/chartex" xmlns:cx3="http://schemas.microsoft.com/office/drawing/2016/5/9/chartex" xmlns:cx4="http://schemas.microsoft.com/office/drawing/2016/5/10/chartex" xmlns:cx5="http://schemas.microsoft.com/office/drawing/2016/5/11/chartex" xmlns:cx6="http://schemas.microsoft.com/office/drawing/2016/5/12/chartex" xmlns:cx7="http://schemas.microsoft.com/office/drawing/2016/5/13/chartex" xmlns:cx8="http://schemas.microsoft.com/office/drawing/2016/5/14/chartex" xmlns:aink="http://schemas.microsoft.com/office/drawing/2016/ink" xmlns:am3d="http://schemas.microsoft.com/office/drawing/2017/model3d" xmlns:w16cex="http://schemas.microsoft.com/office/word/2018/wordml/cex" xmlns:w16cid="http://schemas.microsoft.com/office/word/2016/wordml/cid" xmlns:w16="http://schemas.microsoft.com/office/word/2018/wordml" xmlns:w16sdtdh="http://schemas.microsoft.com/office/word/2020/wordml/sdtdatahash" xmlns:w16se="http://schemas.microsoft.com/office/word/2015/wordml/symex" mc:Ignorable="w14 w15 wp14">
   <w:body>
     <w:p>
@@ -107,7 +129,7 @@
           <w:sz w:val="24"/>
           <w:szCs w:val="24"/>
         </w:rPr>
-        <w:t xml:space="preserve">São Paulo — 2025</w:t>
+        <w:t xml:space="preserve">São Paulo — 2026</w:t>
       </w:r>
     </w:p>
     <w:p>
@@ -3592,7 +3614,7 @@
                 <w:sz w:val="22"/>
                 <w:szCs w:val="22"/>
               </w:rPr>
-              <w:t xml:space="preserve">4</w:t>
+              <w:t xml:space="preserve">5</w:t>
             </w:r>
           </w:p>
         </w:tc>
@@ -3936,7 +3958,7 @@
                 <w:sz w:val="22"/>
                 <w:szCs w:val="22"/>
               </w:rPr>
-              <w:t xml:space="preserve">17 testes</w:t>
+              <w:t xml:space="preserve">18 testes</w:t>
             </w:r>
           </w:p>
         </w:tc>
@@ -4070,7 +4092,7 @@
           <w:sz w:val="24"/>
           <w:szCs w:val="24"/>
         </w:rPr>
-        <w:t xml:space="preserve">O pipeline de CI (GitHub Actions) garante que todos os 17 testes sejam executados a cada push, impedindo que código com falhas seja integrado à branch principal.</w:t>
+        <w:t xml:space="preserve">O pipeline de CI (GitHub Actions) garante que todos os 18 testes sejam executados a cada push, impedindo que código com falhas seja integrado à branch principal.</w:t>
       </w:r>
     </w:p>
     <w:p>
@@ -4221,11 +4243,7 @@
 </w:document>
 </file>
 
-<file path=word/comments.xml><?xml version="1.0" encoding="utf-8"?>
-<w:comments xmlns:cx="http://schemas.microsoft.com/office/drawing/2014/chartex" xmlns:cx1="http://schemas.microsoft.com/office/drawing/2015/9/8/chartex" xmlns:cx2="http://schemas.microsoft.com/office/drawing/2015/10/21/chartex" xmlns:cx3="http://schemas.microsoft.com/office/drawing/2016/5/9/chartex" xmlns:cx4="http://schemas.microsoft.com/office/drawing/2016/5/10/chartex" xmlns:cx5="http://schemas.microsoft.com/office/drawing/2016/5/11/chartex" xmlns:cx6="http://schemas.microsoft.com/office/drawing/2016/5/12/chartex" xmlns:cx7="http://schemas.microsoft.com/office/drawing/2016/5/13/chartex" xmlns:cx8="http://schemas.microsoft.com/office/drawing/2016/5/14/chartex" xmlns:mc="http://schemas.openxmlformats.org/markup-compatibility/2006" xmlns:aink="http://schemas.microsoft.com/office/drawing/2016/ink" xmlns:am3d="http://schemas.microsoft.com/office/drawing/2017/model3d" xmlns:o="urn:schemas-microsoft-com:office:office" xmlns:r="http://schemas.openxmlformats.org/officeDocument/2006/relationships" xmlns:m="http://schemas.openxmlformats.org/officeDocument/2006/math" xmlns:v="urn:schemas-microsoft-com:vml" xmlns:wp14="http://schemas.microsoft.com/office/word/2010/wordprocessingDrawing" xmlns:wp="http://schemas.openxmlformats.org/drawingml/2006/wordprocessingDrawing" xmlns:w10="urn:schemas-microsoft-com:office:word" xmlns:w="http://schemas.openxmlformats.org/wordprocessingml/2006/main" xmlns:w14="http://schemas.microsoft.com/office/word/2010/wordml" xmlns:w15="http://schemas.microsoft.com/office/word/2012/wordml" xmlns:w16cex="http://schemas.microsoft.com/office/word/2018/wordml/cex" xmlns:w16cid="http://schemas.microsoft.com/office/word/2016/wordml/cid" xmlns:w16="http://schemas.microsoft.com/office/word/2018/wordml" xmlns:w16sdtdh="http://schemas.microsoft.com/office/word/2020/wordml/sdtdatahash" xmlns:w16se="http://schemas.microsoft.com/office/word/2015/wordml/symex" xmlns:wpg="http://schemas.microsoft.com/office/word/2010/wordprocessingGroup" xmlns:wpi="http://schemas.microsoft.com/office/word/2010/wordprocessingInk" xmlns:wne="http://schemas.microsoft.com/office/word/2006/wordml" xmlns:wps="http://schemas.microsoft.com/office/word/2010/wordprocessingShape"/>
-</file>
-
-<file path=word/endnotes.xml><?xml version="1.0" encoding="utf-8"?>
+<file path=word\endnotes.xml><?xml version="1.0" encoding="utf-8"?>
 <w:endnotes xmlns:wpc="http://schemas.microsoft.com/office/word/2010/wordprocessingCanvas" xmlns:mc="http://schemas.openxmlformats.org/markup-compatibility/2006" xmlns:o="urn:schemas-microsoft-com:office:office" xmlns:r="http://schemas.openxmlformats.org/officeDocument/2006/relationships" xmlns:m="http://schemas.openxmlformats.org/officeDocument/2006/math" xmlns:v="urn:schemas-microsoft-com:vml" xmlns:wp14="http://schemas.microsoft.com/office/word/2010/wordprocessingDrawing" xmlns:wp="http://schemas.openxmlformats.org/drawingml/2006/wordprocessingDrawing" xmlns:w10="urn:schemas-microsoft-com:office:word" xmlns:w="http://schemas.openxmlformats.org/wordprocessingml/2006/main" xmlns:w14="http://schemas.microsoft.com/office/word/2010/wordml" xmlns:w15="http://schemas.microsoft.com/office/word/2012/wordml" xmlns:wpg="http://schemas.microsoft.com/office/word/2010/wordprocessingGroup" xmlns:wpi="http://schemas.microsoft.com/office/word/2010/wordprocessingInk" xmlns:wne="http://schemas.microsoft.com/office/word/2006/wordml" xmlns:wps="http://schemas.microsoft.com/office/word/2010/wordprocessingShape" mc:Ignorable="w14 w15 wp14">
   <w:endnote w:type="separator" w:id="-1">
     <w:p>
@@ -4262,7 +4280,11 @@
 </w:endnotes>
 </file>
 
-<file path=word/footnotes.xml><?xml version="1.0" encoding="utf-8"?>
+<file path=word\fontTable.xml><?xml version="1.0" encoding="utf-8"?>
+<w:fonts xmlns:mc="http://schemas.openxmlformats.org/markup-compatibility/2006" xmlns:r="http://schemas.openxmlformats.org/officeDocument/2006/relationships" xmlns:w="http://schemas.openxmlformats.org/wordprocessingml/2006/main" xmlns:w14="http://schemas.microsoft.com/office/word/2010/wordml" xmlns:w15="http://schemas.microsoft.com/office/word/2012/wordml" xmlns:w16cex="http://schemas.microsoft.com/office/word/2018/wordml/cex" xmlns:w16cid="http://schemas.microsoft.com/office/word/2016/wordml/cid" xmlns:w16="http://schemas.microsoft.com/office/word/2018/wordml" xmlns:w16sdtdh="http://schemas.microsoft.com/office/word/2020/wordml/sdtdatahash" xmlns:w16se="http://schemas.microsoft.com/office/word/2015/wordml/symex" mc:Ignorable="w14 w15 w16se w16cid w16 w16cex w16sdtdh"/>
+</file>
+
+<file path=word\footnotes.xml><?xml version="1.0" encoding="utf-8"?>
 <w:footnotes xmlns:wpc="http://schemas.microsoft.com/office/word/2010/wordprocessingCanvas" xmlns:mc="http://schemas.openxmlformats.org/markup-compatibility/2006" xmlns:o="urn:schemas-microsoft-com:office:office" xmlns:r="http://schemas.openxmlformats.org/officeDocument/2006/relationships" xmlns:m="http://schemas.openxmlformats.org/officeDocument/2006/math" xmlns:v="urn:schemas-microsoft-com:vml" xmlns:wp14="http://schemas.microsoft.com/office/word/2010/wordprocessingDrawing" xmlns:wp="http://schemas.openxmlformats.org/drawingml/2006/wordprocessingDrawing" xmlns:w10="urn:schemas-microsoft-com:office:word" xmlns:w="http://schemas.openxmlformats.org/wordprocessingml/2006/main" xmlns:w14="http://schemas.microsoft.com/office/word/2010/wordml" xmlns:w15="http://schemas.microsoft.com/office/word/2012/wordml" xmlns:wpg="http://schemas.microsoft.com/office/word/2010/wordprocessingGroup" xmlns:wpi="http://schemas.microsoft.com/office/word/2010/wordprocessingInk" xmlns:wne="http://schemas.microsoft.com/office/word/2006/wordml" xmlns:wps="http://schemas.microsoft.com/office/word/2010/wordprocessingShape" mc:Ignorable="w14 w15 wp14">
   <w:footnote w:type="separator" w:id="-1">
     <w:p>
@@ -4299,7 +4321,7 @@
 </w:footnotes>
 </file>
 
-<file path=word/numbering.xml><?xml version="1.0" encoding="utf-8"?>
+<file path=word\numbering.xml><?xml version="1.0" encoding="utf-8"?>
 <w:numbering xmlns:wpc="http://schemas.microsoft.com/office/word/2010/wordprocessingCanvas" xmlns:mc="http://schemas.openxmlformats.org/markup-compatibility/2006" xmlns:o="urn:schemas-microsoft-com:office:office" xmlns:r="http://schemas.openxmlformats.org/officeDocument/2006/relationships" xmlns:m="http://schemas.openxmlformats.org/officeDocument/2006/math" xmlns:v="urn:schemas-microsoft-com:vml" xmlns:wp14="http://schemas.microsoft.com/office/word/2010/wordprocessingDrawing" xmlns:wp="http://schemas.openxmlformats.org/drawingml/2006/wordprocessingDrawing" xmlns:w10="urn:schemas-microsoft-com:office:word" xmlns:w="http://schemas.openxmlformats.org/wordprocessingml/2006/main" xmlns:w14="http://schemas.microsoft.com/office/word/2010/wordml" xmlns:w15="http://schemas.microsoft.com/office/word/2012/wordml" xmlns:wpg="http://schemas.microsoft.com/office/word/2010/wordprocessingGroup" xmlns:wpi="http://schemas.microsoft.com/office/word/2010/wordprocessingInk" xmlns:wne="http://schemas.microsoft.com/office/word/2006/wordml" xmlns:wps="http://schemas.microsoft.com/office/word/2010/wordprocessingShape" mc:Ignorable="w14 w15 wp14">
   <w:abstractNum w:abstractNumId="1" w15:restartNumberingAfterBreak="0">
     <w:multiLevelType w:val="hybridMultilevel"/>
@@ -4412,7 +4434,17 @@
 </w:numbering>
 </file>
 
-<file path=word/styles.xml><?xml version="1.0" encoding="utf-8"?>
+<file path=word\settings.xml><?xml version="1.0" encoding="utf-8"?>
+<w:settings xmlns:wpc="http://schemas.microsoft.com/office/word/2010/wordprocessingCanvas" xmlns:mc="http://schemas.openxmlformats.org/markup-compatibility/2006" xmlns:o="urn:schemas-microsoft-com:office:office" xmlns:r="http://schemas.openxmlformats.org/officeDocument/2006/relationships" xmlns:m="http://schemas.openxmlformats.org/officeDocument/2006/math" xmlns:v="urn:schemas-microsoft-com:vml" xmlns:wp14="http://schemas.microsoft.com/office/word/2010/wordprocessingDrawing" xmlns:wp="http://schemas.openxmlformats.org/drawingml/2006/wordprocessingDrawing" xmlns:w10="urn:schemas-microsoft-com:office:word" xmlns:w="http://schemas.openxmlformats.org/wordprocessingml/2006/main" xmlns:w14="http://schemas.microsoft.com/office/word/2010/wordml" xmlns:w15="http://schemas.microsoft.com/office/word/2012/wordml" xmlns:wpg="http://schemas.microsoft.com/office/word/2010/wordprocessingGroup" xmlns:wpi="http://schemas.microsoft.com/office/word/2010/wordprocessingInk" xmlns:wne="http://schemas.microsoft.com/office/word/2006/wordml" xmlns:wps="http://schemas.microsoft.com/office/word/2010/wordprocessingShape" mc:Ignorable="w14 w15 wp14">
+  <w:displayBackgroundShape/>
+  <w:evenAndOddHeaders w:val="false"/>
+  <w:compat>
+    <w:compatSetting w:val="15" w:name="compatibilityMode" w:uri="http://schemas.microsoft.com/office/word"/>
+  </w:compat>
+</w:settings>
+</file>
+
+<file path=word\styles.xml><?xml version="1.0" encoding="utf-8"?>
 <w:styles xmlns:mc="http://schemas.openxmlformats.org/markup-compatibility/2006" xmlns:r="http://schemas.openxmlformats.org/officeDocument/2006/relationships" xmlns:w="http://schemas.openxmlformats.org/wordprocessingml/2006/main" xmlns:w14="http://schemas.microsoft.com/office/word/2010/wordml" xmlns:w15="http://schemas.microsoft.com/office/word/2012/wordml" mc:Ignorable="w14 w15">
   <w:docDefaults>
     <w:rPrDefault>

</xml_diff>